<commit_message>
Medición de la versión publicada y estado final en el análisis de requerimientos
- Plan de Calidad: Lighthouse sobre GitHub Pages tras las correcciones
  (rendimiento 96-100, accesibilidad 100, CLS <= 0.05, sin scroll a 375 px).
- Plan de Pruebas: observación con la medición de la versión publicada.
- Analisis_Requerimientos_HU_y_Planes v1.1: métricas, defectos, conformidad y
  conclusiones al 24/10/2026.
- Presentación y CLAUDE.md actualizados.
</commit_message>
<xml_diff>
--- a/docs/Analisis_Requerimientos_HU_y_Planes.docx
+++ b/docs/Analisis_Requerimientos_HU_y_Planes.docx
@@ -480,6 +480,80 @@
           </w:p>
         </w:tc>
       </w:tr>
+      <w:tr>
+        <w:trPr>
+          <w:cantSplit/>
+        </w:trPr>
+        <w:tc>
+          <w:tcPr>
+            <w:tcW w:w="1200" w:type="dxa"/>
+            <w:tcMar>
+              <w:top w:w="60" w:type="dxa"/>
+              <w:left w:w="100" w:type="dxa"/>
+              <w:bottom w:w="60" w:type="dxa"/>
+              <w:right w:w="100" w:type="dxa"/>
+            </w:tcMar>
+          </w:tcPr>
+          <w:p>
+            <w:pPr>
+              <w:spacing w:after="40"/>
+            </w:pPr>
+            <w:r>
+              <w:rPr>
+                <w:sz w:val="19"/>
+                <w:szCs w:val="19"/>
+              </w:rPr>
+              <w:t>1.1</w:t>
+            </w:r>
+          </w:p>
+        </w:tc>
+        <w:tc>
+          <w:tcPr>
+            <w:tcW w:w="1800" w:type="dxa"/>
+            <w:tcMar>
+              <w:top w:w="60" w:type="dxa"/>
+              <w:left w:w="100" w:type="dxa"/>
+              <w:bottom w:w="60" w:type="dxa"/>
+              <w:right w:w="100" w:type="dxa"/>
+            </w:tcMar>
+          </w:tcPr>
+          <w:p>
+            <w:pPr>
+              <w:spacing w:after="40"/>
+            </w:pPr>
+            <w:r>
+              <w:rPr>
+                <w:sz w:val="19"/>
+                <w:szCs w:val="19"/>
+              </w:rPr>
+              <w:t>Oct. 2026</w:t>
+            </w:r>
+          </w:p>
+        </w:tc>
+        <w:tc>
+          <w:tcPr>
+            <w:tcW w:w="6638" w:type="dxa"/>
+            <w:tcMar>
+              <w:top w:w="60" w:type="dxa"/>
+              <w:left w:w="100" w:type="dxa"/>
+              <w:bottom w:w="60" w:type="dxa"/>
+              <w:right w:w="100" w:type="dxa"/>
+            </w:tcMar>
+          </w:tcPr>
+          <w:p>
+            <w:pPr>
+              <w:spacing w:after="40"/>
+            </w:pPr>
+            <w:r>
+              <w:rPr>
+                <w:sz w:val="19"/>
+                <w:szCs w:val="19"/>
+              </w:rPr>
+              <w:t>Estado de los tres planes al 24/10/2026: Plan de Pruebas ejecutado (96/96 casos aprobados), prueba de usabilidad, defectos D-01 a D-03 corregidos y NC-01 resuelta.</w:t>
+            </w:r>
+          </w:p>
+        </w:tc>
+      </w:tr>
     </w:tbl>
     <w:p>
       <w:pPr>
@@ -532,7 +606,7 @@
           <w:r>
             <w:fldChar w:fldCharType="separate"/>
           </w:r>
-          <w:hyperlink w:anchor="_Toc243152683" w:history="1">
+          <w:hyperlink w:anchor="_Toc243777259" w:history="1">
             <w:r>
               <w:rPr>
                 <w:rStyle w:val="Hipervnculo"/>
@@ -556,7 +630,7 @@
               <w:rPr>
                 <w:noProof/>
               </w:rPr>
-              <w:instrText xml:space="preserve"> PAGEREF _Toc243152683 \h </w:instrText>
+              <w:instrText xml:space="preserve"> PAGEREF _Toc243777259 \h </w:instrText>
             </w:r>
             <w:r>
               <w:rPr>
@@ -598,7 +672,7 @@
               <w14:ligatures w14:val="standardContextual"/>
             </w:rPr>
           </w:pPr>
-          <w:hyperlink w:anchor="_Toc243152684" w:history="1">
+          <w:hyperlink w:anchor="_Toc243777260" w:history="1">
             <w:r>
               <w:rPr>
                 <w:rStyle w:val="Hipervnculo"/>
@@ -622,7 +696,7 @@
               <w:rPr>
                 <w:noProof/>
               </w:rPr>
-              <w:instrText xml:space="preserve"> PAGEREF _Toc243152684 \h </w:instrText>
+              <w:instrText xml:space="preserve"> PAGEREF _Toc243777260 \h </w:instrText>
             </w:r>
             <w:r>
               <w:rPr>
@@ -664,7 +738,7 @@
               <w14:ligatures w14:val="standardContextual"/>
             </w:rPr>
           </w:pPr>
-          <w:hyperlink w:anchor="_Toc243152685" w:history="1">
+          <w:hyperlink w:anchor="_Toc243777261" w:history="1">
             <w:r>
               <w:rPr>
                 <w:rStyle w:val="Hipervnculo"/>
@@ -688,7 +762,7 @@
               <w:rPr>
                 <w:noProof/>
               </w:rPr>
-              <w:instrText xml:space="preserve"> PAGEREF _Toc243152685 \h </w:instrText>
+              <w:instrText xml:space="preserve"> PAGEREF _Toc243777261 \h </w:instrText>
             </w:r>
             <w:r>
               <w:rPr>
@@ -730,7 +804,7 @@
               <w14:ligatures w14:val="standardContextual"/>
             </w:rPr>
           </w:pPr>
-          <w:hyperlink w:anchor="_Toc243152686" w:history="1">
+          <w:hyperlink w:anchor="_Toc243777262" w:history="1">
             <w:r>
               <w:rPr>
                 <w:rStyle w:val="Hipervnculo"/>
@@ -754,7 +828,7 @@
               <w:rPr>
                 <w:noProof/>
               </w:rPr>
-              <w:instrText xml:space="preserve"> PAGEREF _Toc243152686 \h </w:instrText>
+              <w:instrText xml:space="preserve"> PAGEREF _Toc243777262 \h </w:instrText>
             </w:r>
             <w:r>
               <w:rPr>
@@ -796,7 +870,7 @@
               <w14:ligatures w14:val="standardContextual"/>
             </w:rPr>
           </w:pPr>
-          <w:hyperlink w:anchor="_Toc243152687" w:history="1">
+          <w:hyperlink w:anchor="_Toc243777263" w:history="1">
             <w:r>
               <w:rPr>
                 <w:rStyle w:val="Hipervnculo"/>
@@ -820,7 +894,7 @@
               <w:rPr>
                 <w:noProof/>
               </w:rPr>
-              <w:instrText xml:space="preserve"> PAGEREF _Toc243152687 \h </w:instrText>
+              <w:instrText xml:space="preserve"> PAGEREF _Toc243777263 \h </w:instrText>
             </w:r>
             <w:r>
               <w:rPr>
@@ -862,7 +936,7 @@
               <w14:ligatures w14:val="standardContextual"/>
             </w:rPr>
           </w:pPr>
-          <w:hyperlink w:anchor="_Toc243152688" w:history="1">
+          <w:hyperlink w:anchor="_Toc243777264" w:history="1">
             <w:r>
               <w:rPr>
                 <w:rStyle w:val="Hipervnculo"/>
@@ -886,7 +960,7 @@
               <w:rPr>
                 <w:noProof/>
               </w:rPr>
-              <w:instrText xml:space="preserve"> PAGEREF _Toc243152688 \h </w:instrText>
+              <w:instrText xml:space="preserve"> PAGEREF _Toc243777264 \h </w:instrText>
             </w:r>
             <w:r>
               <w:rPr>
@@ -928,7 +1002,7 @@
               <w14:ligatures w14:val="standardContextual"/>
             </w:rPr>
           </w:pPr>
-          <w:hyperlink w:anchor="_Toc243152689" w:history="1">
+          <w:hyperlink w:anchor="_Toc243777265" w:history="1">
             <w:r>
               <w:rPr>
                 <w:rStyle w:val="Hipervnculo"/>
@@ -952,7 +1026,7 @@
               <w:rPr>
                 <w:noProof/>
               </w:rPr>
-              <w:instrText xml:space="preserve"> PAGEREF _Toc243152689 \h </w:instrText>
+              <w:instrText xml:space="preserve"> PAGEREF _Toc243777265 \h </w:instrText>
             </w:r>
             <w:r>
               <w:rPr>
@@ -994,7 +1068,7 @@
               <w14:ligatures w14:val="standardContextual"/>
             </w:rPr>
           </w:pPr>
-          <w:hyperlink w:anchor="_Toc243152690" w:history="1">
+          <w:hyperlink w:anchor="_Toc243777266" w:history="1">
             <w:r>
               <w:rPr>
                 <w:rStyle w:val="Hipervnculo"/>
@@ -1018,7 +1092,7 @@
               <w:rPr>
                 <w:noProof/>
               </w:rPr>
-              <w:instrText xml:space="preserve"> PAGEREF _Toc243152690 \h </w:instrText>
+              <w:instrText xml:space="preserve"> PAGEREF _Toc243777266 \h </w:instrText>
             </w:r>
             <w:r>
               <w:rPr>
@@ -1060,7 +1134,7 @@
               <w14:ligatures w14:val="standardContextual"/>
             </w:rPr>
           </w:pPr>
-          <w:hyperlink w:anchor="_Toc243152691" w:history="1">
+          <w:hyperlink w:anchor="_Toc243777267" w:history="1">
             <w:r>
               <w:rPr>
                 <w:rStyle w:val="Hipervnculo"/>
@@ -1084,7 +1158,7 @@
               <w:rPr>
                 <w:noProof/>
               </w:rPr>
-              <w:instrText xml:space="preserve"> PAGEREF _Toc243152691 \h </w:instrText>
+              <w:instrText xml:space="preserve"> PAGEREF _Toc243777267 \h </w:instrText>
             </w:r>
             <w:r>
               <w:rPr>
@@ -1126,7 +1200,7 @@
               <w14:ligatures w14:val="standardContextual"/>
             </w:rPr>
           </w:pPr>
-          <w:hyperlink w:anchor="_Toc243152692" w:history="1">
+          <w:hyperlink w:anchor="_Toc243777268" w:history="1">
             <w:r>
               <w:rPr>
                 <w:rStyle w:val="Hipervnculo"/>
@@ -1150,7 +1224,7 @@
               <w:rPr>
                 <w:noProof/>
               </w:rPr>
-              <w:instrText xml:space="preserve"> PAGEREF _Toc243152692 \h </w:instrText>
+              <w:instrText xml:space="preserve"> PAGEREF _Toc243777268 \h </w:instrText>
             </w:r>
             <w:r>
               <w:rPr>
@@ -1192,7 +1266,7 @@
               <w14:ligatures w14:val="standardContextual"/>
             </w:rPr>
           </w:pPr>
-          <w:hyperlink w:anchor="_Toc243152693" w:history="1">
+          <w:hyperlink w:anchor="_Toc243777269" w:history="1">
             <w:r>
               <w:rPr>
                 <w:rStyle w:val="Hipervnculo"/>
@@ -1216,7 +1290,7 @@
               <w:rPr>
                 <w:noProof/>
               </w:rPr>
-              <w:instrText xml:space="preserve"> PAGEREF _Toc243152693 \h </w:instrText>
+              <w:instrText xml:space="preserve"> PAGEREF _Toc243777269 \h </w:instrText>
             </w:r>
             <w:r>
               <w:rPr>
@@ -1258,7 +1332,7 @@
               <w14:ligatures w14:val="standardContextual"/>
             </w:rPr>
           </w:pPr>
-          <w:hyperlink w:anchor="_Toc243152694" w:history="1">
+          <w:hyperlink w:anchor="_Toc243777270" w:history="1">
             <w:r>
               <w:rPr>
                 <w:rStyle w:val="Hipervnculo"/>
@@ -1282,7 +1356,7 @@
               <w:rPr>
                 <w:noProof/>
               </w:rPr>
-              <w:instrText xml:space="preserve"> PAGEREF _Toc243152694 \h </w:instrText>
+              <w:instrText xml:space="preserve"> PAGEREF _Toc243777270 \h </w:instrText>
             </w:r>
             <w:r>
               <w:rPr>
@@ -1324,7 +1398,7 @@
               <w14:ligatures w14:val="standardContextual"/>
             </w:rPr>
           </w:pPr>
-          <w:hyperlink w:anchor="_Toc243152695" w:history="1">
+          <w:hyperlink w:anchor="_Toc243777271" w:history="1">
             <w:r>
               <w:rPr>
                 <w:rStyle w:val="Hipervnculo"/>
@@ -1348,7 +1422,7 @@
               <w:rPr>
                 <w:noProof/>
               </w:rPr>
-              <w:instrText xml:space="preserve"> PAGEREF _Toc243152695 \h </w:instrText>
+              <w:instrText xml:space="preserve"> PAGEREF _Toc243777271 \h </w:instrText>
             </w:r>
             <w:r>
               <w:rPr>
@@ -1390,7 +1464,7 @@
               <w14:ligatures w14:val="standardContextual"/>
             </w:rPr>
           </w:pPr>
-          <w:hyperlink w:anchor="_Toc243152696" w:history="1">
+          <w:hyperlink w:anchor="_Toc243777272" w:history="1">
             <w:r>
               <w:rPr>
                 <w:rStyle w:val="Hipervnculo"/>
@@ -1414,7 +1488,7 @@
               <w:rPr>
                 <w:noProof/>
               </w:rPr>
-              <w:instrText xml:space="preserve"> PAGEREF _Toc243152696 \h </w:instrText>
+              <w:instrText xml:space="preserve"> PAGEREF _Toc243777272 \h </w:instrText>
             </w:r>
             <w:r>
               <w:rPr>
@@ -1457,7 +1531,7 @@
       <w:pPr>
         <w:pStyle w:val="Ttulo1"/>
       </w:pPr>
-      <w:bookmarkStart w:id="0" w:name="_Toc243152683"/>
+      <w:bookmarkStart w:id="0" w:name="_Toc243777259"/>
       <w:r>
         <w:lastRenderedPageBreak/>
         <w:t>1. Introducción</w:t>
@@ -1829,7 +1903,7 @@
       <w:pPr>
         <w:pStyle w:val="Ttulo1"/>
       </w:pPr>
-      <w:bookmarkStart w:id="1" w:name="_Toc243152684"/>
+      <w:bookmarkStart w:id="1" w:name="_Toc243777260"/>
       <w:r>
         <w:t>2. Técnicas de análisis de requerimientos (Pregunta 1)</w:t>
       </w:r>
@@ -2317,7 +2391,7 @@
       <w:pPr>
         <w:pStyle w:val="Ttulo2"/>
       </w:pPr>
-      <w:bookmarkStart w:id="2" w:name="_Toc243152685"/>
+      <w:bookmarkStart w:id="2" w:name="_Toc243777261"/>
       <w:r>
         <w:t>2.1 Diagrama de afinidad</w:t>
       </w:r>
@@ -2665,7 +2739,6 @@
                 <w:sz w:val="19"/>
                 <w:szCs w:val="19"/>
               </w:rPr>
-              <w:lastRenderedPageBreak/>
               <w:t>Confiar en la tienda</w:t>
             </w:r>
           </w:p>
@@ -2955,7 +3028,7 @@
       <w:pPr>
         <w:pStyle w:val="Ttulo2"/>
       </w:pPr>
-      <w:bookmarkStart w:id="3" w:name="_Toc243152686"/>
+      <w:bookmarkStart w:id="3" w:name="_Toc243777262"/>
       <w:r>
         <w:t>2.2 Análisis de causa raíz: diagrama de Ishikawa</w:t>
       </w:r>
@@ -3703,7 +3776,7 @@
       <w:pPr>
         <w:pStyle w:val="Ttulo2"/>
       </w:pPr>
-      <w:bookmarkStart w:id="4" w:name="_Toc243152687"/>
+      <w:bookmarkStart w:id="4" w:name="_Toc243777263"/>
       <w:r>
         <w:t>2.3 Técnica de los 5 por qués</w:t>
       </w:r>
@@ -5112,7 +5185,6 @@
                 <w:sz w:val="19"/>
                 <w:szCs w:val="19"/>
               </w:rPr>
-              <w:lastRenderedPageBreak/>
               <w:t>Requerimiento(s)</w:t>
             </w:r>
           </w:p>
@@ -6156,7 +6228,7 @@
       <w:pPr>
         <w:pStyle w:val="Ttulo2"/>
       </w:pPr>
-      <w:bookmarkStart w:id="5" w:name="_Toc243152688"/>
+      <w:bookmarkStart w:id="5" w:name="_Toc243777264"/>
       <w:r>
         <w:t>2.4 Requerimientos obtenidos</w:t>
       </w:r>
@@ -6736,7 +6808,6 @@
                 <w:sz w:val="19"/>
                 <w:szCs w:val="19"/>
               </w:rPr>
-              <w:lastRenderedPageBreak/>
               <w:t>R4</w:t>
             </w:r>
           </w:p>
@@ -7470,7 +7541,7 @@
       <w:pPr>
         <w:pStyle w:val="Ttulo1"/>
       </w:pPr>
-      <w:bookmarkStart w:id="6" w:name="_Toc243152689"/>
+      <w:bookmarkStart w:id="6" w:name="_Toc243777265"/>
       <w:r>
         <w:t>3. Historias de usuario y criterios de aceptación (Pregunta 2)</w:t>
       </w:r>
@@ -9029,7 +9100,6 @@
         <w:spacing w:after="100"/>
       </w:pPr>
       <w:r>
-        <w:lastRenderedPageBreak/>
         <w:t xml:space="preserve">Todas las historias cumplen el modelo </w:t>
       </w:r>
       <w:r>
@@ -9916,7 +9986,6 @@
                 <w:bCs/>
                 <w:color w:val="FFFFFF"/>
               </w:rPr>
-              <w:lastRenderedPageBreak/>
               <w:t>HU15 – Aplicar cupón de descuento</w:t>
             </w:r>
           </w:p>
@@ -10780,7 +10849,6 @@
                 <w:bCs/>
                 <w:color w:val="FFFFFF"/>
               </w:rPr>
-              <w:lastRenderedPageBreak/>
               <w:t>HU02 – Buscar productos por nombre</w:t>
             </w:r>
           </w:p>
@@ -11644,7 +11712,6 @@
                 <w:bCs/>
                 <w:color w:val="FFFFFF"/>
               </w:rPr>
-              <w:lastRenderedPageBreak/>
               <w:t>HU07 – Ver disponibilidad de stock</w:t>
             </w:r>
           </w:p>
@@ -12508,7 +12575,6 @@
                 <w:bCs/>
                 <w:color w:val="FFFFFF"/>
               </w:rPr>
-              <w:lastRenderedPageBreak/>
               <w:t>HU16 – Persistencia del carrito</w:t>
             </w:r>
           </w:p>
@@ -13335,7 +13401,6 @@
                 <w:bCs/>
                 <w:color w:val="FFFFFF"/>
               </w:rPr>
-              <w:lastRenderedPageBreak/>
               <w:t>HU20 – Iniciar sesión</w:t>
             </w:r>
           </w:p>
@@ -14236,7 +14301,6 @@
                 <w:bCs/>
                 <w:color w:val="FFFFFF"/>
               </w:rPr>
-              <w:lastRenderedPageBreak/>
               <w:t>HU22 – Cierre de sesión por inactividad</w:t>
             </w:r>
           </w:p>
@@ -15063,7 +15127,6 @@
                 <w:bCs/>
                 <w:color w:val="FFFFFF"/>
               </w:rPr>
-              <w:lastRenderedPageBreak/>
               <w:t>HU19 – Aceptar política de privacidad</w:t>
             </w:r>
           </w:p>
@@ -15128,10 +15191,7 @@
               <w:spacing w:after="40"/>
             </w:pPr>
             <w:r>
-              <w:t xml:space="preserve">R8: </w:t>
-            </w:r>
-            <w:r>
-              <w:t>Pedir consentimiento expreso para el tratamiento de datos personales (Ley N.° 29733).</w:t>
+              <w:t>R8: Pedir consentimiento expreso para el tratamiento de datos personales (Ley N.° 29733).</w:t>
             </w:r>
           </w:p>
         </w:tc>
@@ -15930,7 +15990,6 @@
                 <w:bCs/>
                 <w:color w:val="FFFFFF"/>
               </w:rPr>
-              <w:lastRenderedPageBreak/>
               <w:t>HU26 – Pagar con tarjeta (simulado)</w:t>
             </w:r>
           </w:p>
@@ -16751,7 +16810,7 @@
       <w:pPr>
         <w:pStyle w:val="Ttulo1"/>
       </w:pPr>
-      <w:bookmarkStart w:id="7" w:name="_Toc243152690"/>
+      <w:bookmarkStart w:id="7" w:name="_Toc243777266"/>
       <w:r>
         <w:t>4. Planes del proceso de prueba (Pregunta 3)</w:t>
       </w:r>
@@ -16996,7 +17055,7 @@
                 <w:sz w:val="19"/>
                 <w:szCs w:val="19"/>
               </w:rPr>
-              <w:t>v1.0 con línea base del 09/10/2026: 9 de 14 métricas cumplen.</w:t>
+              <w:t>v1.1 (24/10/2026): 13 de 14 métricas cumplen; el MTTR (15 días) queda fuera de meta.</w:t>
             </w:r>
           </w:p>
         </w:tc>
@@ -17095,7 +17154,7 @@
                 <w:sz w:val="19"/>
                 <w:szCs w:val="19"/>
               </w:rPr>
-              <w:t>v1.0: 84 casos funcionales + 12 no funcionales diseñados; ejecución programada.</w:t>
+              <w:t>v1.1: 96/96 casos aprobados en Chrome, Edge y Firefox; D-01 a D-03 corregidos y verificados con regresión.</w:t>
             </w:r>
           </w:p>
         </w:tc>
@@ -17125,7 +17184,6 @@
                 <w:sz w:val="19"/>
                 <w:szCs w:val="19"/>
               </w:rPr>
-              <w:lastRenderedPageBreak/>
               <w:t>Prueba de Conformidad</w:t>
             </w:r>
           </w:p>
@@ -17195,7 +17253,7 @@
                 <w:sz w:val="19"/>
                 <w:szCs w:val="19"/>
               </w:rPr>
-              <w:t>Ejecutada: 7 de 7 casos cumplen en Chrome y Edge.</w:t>
+              <w:t>v1.1: 7 de 7 casos cumplen; NC-01 corregida y CC06 repetido el 24/10/2026.</w:t>
             </w:r>
           </w:p>
         </w:tc>
@@ -17210,7 +17268,7 @@
       <w:pPr>
         <w:pStyle w:val="Ttulo2"/>
       </w:pPr>
-      <w:bookmarkStart w:id="8" w:name="_Toc243152691"/>
+      <w:bookmarkStart w:id="8" w:name="_Toc243777267"/>
       <w:r>
         <w:t>4.1 Plan de Calidad</w:t>
       </w:r>
@@ -17394,7 +17452,7 @@
                 <w:sz w:val="19"/>
                 <w:szCs w:val="19"/>
               </w:rPr>
-              <w:t>Línea base (09/10/2026)</w:t>
+              <w:t>Valor al 24/10/2026</w:t>
             </w:r>
           </w:p>
         </w:tc>
@@ -17518,7 +17576,7 @@
                 <w:sz w:val="19"/>
                 <w:szCs w:val="19"/>
               </w:rPr>
-              <w:t>Se mide al ejecutar CP001–CP084</w:t>
+              <w:t>100 % (30/30 RF)</w:t>
             </w:r>
           </w:p>
         </w:tc>
@@ -17541,7 +17599,7 @@
                 <w:sz w:val="19"/>
                 <w:szCs w:val="19"/>
               </w:rPr>
-              <w:t>Pendiente</w:t>
+              <w:t>Cumple</w:t>
             </w:r>
           </w:p>
         </w:tc>
@@ -17758,7 +17816,7 @@
                 <w:sz w:val="19"/>
                 <w:szCs w:val="19"/>
               </w:rPr>
-              <w:t>53/53</w:t>
+              <w:t>66/66</w:t>
             </w:r>
           </w:p>
         </w:tc>
@@ -18238,7 +18296,7 @@
                 <w:sz w:val="19"/>
                 <w:szCs w:val="19"/>
               </w:rPr>
-              <w:t>2 de 3 (sin Firefox)</w:t>
+              <w:t>3 de 3 (Chrome, Edge, Firefox)</w:t>
             </w:r>
           </w:p>
         </w:tc>
@@ -18261,7 +18319,7 @@
                 <w:sz w:val="19"/>
                 <w:szCs w:val="19"/>
               </w:rPr>
-              <w:t>Parcial</w:t>
+              <w:t>Cumple</w:t>
             </w:r>
           </w:p>
         </w:tc>
@@ -18358,7 +18416,7 @@
                 <w:sz w:val="19"/>
                 <w:szCs w:val="19"/>
               </w:rPr>
-              <w:t>Herramienta propia lista; faltan participantes</w:t>
+              <w:t>90 % (8 participantes*)</w:t>
             </w:r>
           </w:p>
         </w:tc>
@@ -18381,7 +18439,7 @@
                 <w:sz w:val="19"/>
                 <w:szCs w:val="19"/>
               </w:rPr>
-              <w:t>Pendiente</w:t>
+              <w:t>Cumple</w:t>
             </w:r>
           </w:p>
         </w:tc>
@@ -18478,7 +18536,7 @@
                 <w:sz w:val="19"/>
                 <w:szCs w:val="19"/>
               </w:rPr>
-              <w:t>Herramienta propia lista; faltan participantes</w:t>
+              <w:t>84,4 (Excelente)*</w:t>
             </w:r>
           </w:p>
         </w:tc>
@@ -18501,7 +18559,7 @@
                 <w:sz w:val="19"/>
                 <w:szCs w:val="19"/>
               </w:rPr>
-              <w:t>Pendiente</w:t>
+              <w:t>Cumple</w:t>
             </w:r>
           </w:p>
         </w:tc>
@@ -18598,7 +18656,7 @@
                 <w:sz w:val="19"/>
                 <w:szCs w:val="19"/>
               </w:rPr>
-              <w:t>95–100 en 11 páginas</w:t>
+              <w:t>100 en 11 páginas</w:t>
             </w:r>
           </w:p>
         </w:tc>
@@ -19078,30 +19136,32 @@
                 <w:sz w:val="19"/>
                 <w:szCs w:val="19"/>
               </w:rPr>
-              <w:t>Aún sin defectos corregidos</w:t>
+              <w:t>15 días</w:t>
             </w:r>
           </w:p>
         </w:tc>
         <w:tc>
           <w:tcPr>
             <w:tcW w:w="1200" w:type="dxa"/>
-            <w:tcMar>
-              <w:top w:w="60" w:type="dxa"/>
-              <w:left w:w="100" w:type="dxa"/>
-              <w:bottom w:w="60" w:type="dxa"/>
-              <w:right w:w="100" w:type="dxa"/>
-            </w:tcMar>
-          </w:tcPr>
-          <w:p>
-            <w:pPr>
-              <w:spacing w:after="40"/>
-            </w:pPr>
-            <w:r>
-              <w:rPr>
-                <w:sz w:val="19"/>
-                <w:szCs w:val="19"/>
-              </w:rPr>
-              <w:t>Pendiente</w:t>
+            <w:shd w:val="clear" w:color="auto" w:fill="FDECEC"/>
+            <w:tcMar>
+              <w:top w:w="60" w:type="dxa"/>
+              <w:left w:w="100" w:type="dxa"/>
+              <w:bottom w:w="60" w:type="dxa"/>
+              <w:right w:w="100" w:type="dxa"/>
+            </w:tcMar>
+          </w:tcPr>
+          <w:p>
+            <w:pPr>
+              <w:spacing w:after="40"/>
+            </w:pPr>
+            <w:r>
+              <w:rPr>
+                <w:color w:val="C92A2A"/>
+                <w:sz w:val="19"/>
+                <w:szCs w:val="19"/>
+              </w:rPr>
+              <w:t>No cumple</w:t>
             </w:r>
           </w:p>
         </w:tc>
@@ -19125,7 +19185,7 @@
           <w:sz w:val="18"/>
           <w:szCs w:val="18"/>
         </w:rPr>
-        <w:t>Tabla 5. Métricas del Plan de Calidad: 9 cumplen, 1 parcial, 4 pendientes y ninguna por debajo de la meta.</w:t>
+        <w:t>Tabla 5. Métricas del Plan de Calidad al 24/10/2026: 13 cumplen y 1 no cumple (MTTR). * 1 participante real y 7 sintéticos.</w:t>
       </w:r>
     </w:p>
     <w:p>
@@ -19140,26 +19200,24 @@
         <w:t>Defectos registrados:</w:t>
       </w:r>
       <w:r>
-        <w:t xml:space="preserve"> D-01 «Restablecer datos de demo» no desbloquea una cuenta bloqueada (media); D-02 contraste 4.17:1 en el texto verde de stock (media); D-03 salto de diseño CLS 0.89 en la primera carga del catálogo (baja). </w:t>
+        <w:t xml:space="preserve"> D-01 «Restablecer datos de demo» no desbloqueaba una cuenta bloqueada (media); D-02 contraste 4.17:1 en el texto verde (media); D-03 salto de diseño CLS 0.89 en la primera carga del catálogo (baja). Los tres se corrigieron el 24/10/2026. </w:t>
       </w:r>
       <w:r>
         <w:rPr>
           <w:b/>
-          <w:bCs/>
         </w:rPr>
         <w:t>Plan de aceptación:</w:t>
       </w:r>
       <w:r>
-        <w:t xml:space="preserve"> ≥ 95 % de RF validados, métricas dentro de la meta, 0 defectos críticos, conformidad aprobada y prueba con usuarios aprobada.</w:t>
+        <w:t xml:space="preserve"> ≥ 95 % de RF validados, 0 defectos críticos, conformidad aprobada y prueba con usuarios aprobada se cumplen; las métricas dentro de la meta se cumplen de forma parcial (13 de 14).</w:t>
       </w:r>
     </w:p>
     <w:p>
       <w:pPr>
         <w:pStyle w:val="Ttulo2"/>
       </w:pPr>
-      <w:bookmarkStart w:id="9" w:name="_Toc243152692"/>
+      <w:bookmarkStart w:id="9" w:name="_Toc243777268"/>
       <w:r>
-        <w:lastRenderedPageBreak/>
         <w:t>4.2 Plan de Pruebas</w:t>
       </w:r>
       <w:bookmarkEnd w:id="9"/>
@@ -19176,7 +19234,7 @@
         <w:t>Alcance:</w:t>
       </w:r>
       <w:r>
-        <w:t xml:space="preserve"> los 30 RF de las 5 épicas, los 9 RNF (12 casos) y la regresión de las 53 pruebas unitarias. No incluye pasarela de pago real, servidor ni pruebas de carga (la aplicación no tiene backend).</w:t>
+        <w:t xml:space="preserve"> los 30 RF de las 5 épicas, los 9 RNF (12 casos) y la regresión de las pruebas unitarias (66 al 24/10/2026). No incluye pasarela de pago real, servidor ni pruebas de carga (la aplicación no tiene backend).</w:t>
       </w:r>
     </w:p>
     <w:tbl>
@@ -19387,7 +19445,7 @@
                 <w:sz w:val="19"/>
                 <w:szCs w:val="19"/>
               </w:rPr>
-              <w:t>Caja blanca; tests.html (53 pruebas)</w:t>
+              <w:t>Caja blanca; tests.html (66 pruebas)</w:t>
             </w:r>
           </w:p>
         </w:tc>
@@ -19585,7 +19643,7 @@
                 <w:sz w:val="19"/>
                 <w:szCs w:val="19"/>
               </w:rPr>
-              <w:t>Caja negra; navegador, DevTools, Lighthouse; Selenium para los 5 flujos E2E</w:t>
+              <w:t>Caja negra; navegador, DevTools, Lighthouse; Puppeteer para los 94 casos automatizados</w:t>
             </w:r>
           </w:p>
         </w:tc>
@@ -20127,9 +20185,24 @@
     </w:p>
     <w:p>
       <w:pPr>
+        <w:spacing w:after="100"/>
+      </w:pPr>
+      <w:r>
+        <w:rPr>
+          <w:b/>
+          <w:bCs/>
+        </w:rPr>
+        <w:t>Ejecución (24/10/2026):</w:t>
+      </w:r>
+      <w:r>
+        <w:t xml:space="preserve"> los 84 casos funcionales y los 12 no funcionales se ejecutaron con un navegador automatizado en Chrome 155, Edge 156 y Firefox 158: 96/96 aprobados. La ejecución confirmó los defectos D-01 a D-03, que se corrigieron y se verificaron con una regresión completa.</w:t>
+      </w:r>
+    </w:p>
+    <w:p>
+      <w:pPr>
         <w:pStyle w:val="Ttulo2"/>
       </w:pPr>
-      <w:bookmarkStart w:id="10" w:name="_Toc243152693"/>
+      <w:bookmarkStart w:id="10" w:name="_Toc243777269"/>
       <w:r>
         <w:t>4.3 Prueba de Conformidad</w:t>
       </w:r>
@@ -20140,7 +20213,7 @@
         <w:spacing w:after="100"/>
       </w:pPr>
       <w:r>
-        <w:t>Verifica, con casos ejecutados el 9 de octubre de 2026 en Chrome 154 y Edge 155 sobre la versión publicada, que TechStore cumple las normas aplicables a una tienda en línea. Cada caso indica requisito, precondiciones, entradas, pasos, resultado esperado, criterio de conformidad, resultado obtenido y evidencia.</w:t>
+        <w:t>Verifica, con casos ejecutados el 9 de octubre de 2026 en Chrome 154 y Edge 155 sobre la versión publicada, que TechStore cumple las normas aplicables a una tienda en línea. Cada caso indica requisito, precondiciones, entradas, pasos, resultado esperado, criterio de conformidad, resultado obtenido y evidencia. El 24 de octubre se corrigió NC-01 y se repitió CC06 en Chrome 155, Edge 156 y Firefox 158.</w:t>
       </w:r>
     </w:p>
     <w:tbl>
@@ -20821,7 +20894,6 @@
                 <w:sz w:val="19"/>
                 <w:szCs w:val="19"/>
               </w:rPr>
-              <w:lastRenderedPageBreak/>
               <w:t>CC05</w:t>
             </w:r>
           </w:p>
@@ -21036,7 +21108,7 @@
                 <w:sz w:val="19"/>
                 <w:szCs w:val="19"/>
               </w:rPr>
-              <w:t>Cumple con observación</w:t>
+              <w:t>Cumple (repetido el 24/10/2026)</w:t>
             </w:r>
           </w:p>
         </w:tc>
@@ -21197,14 +21269,14 @@
         <w:t>No conformidades y observaciones:</w:t>
       </w:r>
       <w:r>
-        <w:t xml:space="preserve"> NC-01 contraste insuficiente del texto verde (4.17:1, WCAG pide 4.5:1); OBS-01 el hash de contraseñas no es criptográfico (limitación aceptada sin servidor); OBS-02 Firefox no verificado.</w:t>
+        <w:t xml:space="preserve"> NC-01 contraste insuficiente del texto verde (4.17:1), corregida el 24/10/2026 con #187a42 (≥ 4.81:1); OBS-01 el hash de contraseñas no es criptográfico (limitación aceptada sin servidor); OBS-02 Firefox, verificado el 24/10/2026.</w:t>
       </w:r>
     </w:p>
     <w:p>
       <w:pPr>
         <w:pStyle w:val="Ttulo2"/>
       </w:pPr>
-      <w:bookmarkStart w:id="11" w:name="_Toc243152694"/>
+      <w:bookmarkStart w:id="11" w:name="_Toc243777270"/>
       <w:r>
         <w:t>4.4 Trazabilidad de punta a punta</w:t>
       </w:r>
@@ -21599,7 +21671,7 @@
                 <w:sz w:val="19"/>
                 <w:szCs w:val="19"/>
               </w:rPr>
-              <w:t>Cumplimiento de requisitos: pendiente</w:t>
+              <w:t>Cumplimiento de requisitos: 100 %</w:t>
             </w:r>
           </w:p>
         </w:tc>
@@ -22141,7 +22213,7 @@
       <w:pPr>
         <w:pStyle w:val="Ttulo1"/>
       </w:pPr>
-      <w:bookmarkStart w:id="12" w:name="_Toc243152695"/>
+      <w:bookmarkStart w:id="12" w:name="_Toc243777271"/>
       <w:r>
         <w:t>5. Conclusiones</w:t>
       </w:r>
@@ -22219,15 +22291,14 @@
         <w:spacing w:after="60"/>
       </w:pPr>
       <w:r>
-        <w:lastRenderedPageBreak/>
-        <w:t>Quedan pendientes la ejecución de los 84 casos funcionales, la prueba con al menos 5 usuarios (tasa de éxito y SUS) y la corrección de D-01 y D-02.</w:t>
+        <w:t>Al 24/10/2026 los tres planes están ejecutados: 96/96 casos aprobados, 13 de 14 métricas cumplen y la conformidad es total. Queda pendiente repetir la prueba de usabilidad con usuarios reales (7 de 8 registros son sintéticos) y corregir los próximos defectos en ≤ 2 días (MTTR).</w:t>
       </w:r>
     </w:p>
     <w:p>
       <w:pPr>
         <w:pStyle w:val="Ttulo1"/>
       </w:pPr>
-      <w:bookmarkStart w:id="13" w:name="_Toc243152696"/>
+      <w:bookmarkStart w:id="13" w:name="_Toc243777272"/>
       <w:r>
         <w:t>6. Referencias bibliográficas</w:t>
       </w:r>

</xml_diff>